<commit_message>
Add system guide and update paper figures to the new interface
</commit_message>
<xml_diff>
--- a/docs/paper/paper.docx
+++ b/docs/paper/paper.docx
@@ -1558,7 +1558,7 @@
       <w:r>
         <w:drawing>
           <wp:inline distT="0" distB="0" distL="0" distR="0">
-            <wp:extent cx="2857500" cy="742950"/>
+            <wp:extent cx="2857500" cy="1762125"/>
             <wp:effectExtent t="0" r="0" b="0" l="0"/>
             <wp:docPr id="1" name="" descr="" title=""/>
             <wp:cNvGraphicFramePr>
@@ -1583,7 +1583,7 @@
                   <pic:spPr bwMode="auto">
                     <a:xfrm>
                       <a:off x="0" y="0"/>
-                      <a:ext cx="2857500" cy="742950"/>
+                      <a:ext cx="2857500" cy="1762125"/>
                     </a:xfrm>
                     <a:prstGeom prst="rect">
                       <a:avLst/>
@@ -1606,7 +1606,250 @@
           <w:sz w:val="17"/>
           <w:szCs w:val="17"/>
         </w:rPr>
-        <w:t xml:space="preserve">Fig. 3. A verified answer in the web interface during a real query on a ContractNLI agreement: one claim, VCS 0.84, cited to paragraph 7 of the Yahoo!–Restrac agreement.</w:t>
+        <w:t xml:space="preserve">Fig. 3. The proof view of a verified answer on a real non-disclosure agreement. The first of two claims is open, with the paragraph it cites and each layer’s verdict; V4 shows as skipped because the interface does not resample.</w:t>
+      </w:r>
+    </w:p>
+    <w:p>
+      <w:pPr>
+        <w:keepNext/>
+        <w:spacing w:after="60" w:before="120"/>
+        <w:jc w:val="center"/>
+      </w:pPr>
+      <w:r>
+        <w:drawing>
+          <wp:inline distT="0" distB="0" distL="0" distR="0">
+            <wp:extent cx="2857500" cy="1209675"/>
+            <wp:effectExtent t="0" r="0" b="0" l="0"/>
+            <wp:docPr id="1" name="" descr="" title=""/>
+            <wp:cNvGraphicFramePr>
+              <a:graphicFrameLocks xmlns:a="http://schemas.openxmlformats.org/drawingml/2006/main" noChangeAspect="1"/>
+            </wp:cNvGraphicFramePr>
+            <a:graphic xmlns:a="http://schemas.openxmlformats.org/drawingml/2006/main">
+              <a:graphicData uri="http://schemas.openxmlformats.org/drawingml/2006/picture">
+                <pic:pic xmlns:pic="http://schemas.openxmlformats.org/drawingml/2006/picture">
+                  <pic:nvPicPr>
+                    <pic:cNvPr id="0" name="" descr=""/>
+                    <pic:cNvPicPr>
+                      <a:picLocks noChangeAspect="1" noChangeArrowheads="1"/>
+                    </pic:cNvPicPr>
+                  </pic:nvPicPr>
+                  <pic:blipFill>
+                    <a:blip r:embed="rId10" cstate="none"/>
+                    <a:srcRect/>
+                    <a:stretch>
+                      <a:fillRect/>
+                    </a:stretch>
+                  </pic:blipFill>
+                  <pic:spPr bwMode="auto">
+                    <a:xfrm>
+                      <a:off x="0" y="0"/>
+                      <a:ext cx="2857500" cy="1209675"/>
+                    </a:xfrm>
+                    <a:prstGeom prst="rect">
+                      <a:avLst/>
+                    </a:prstGeom>
+                  </pic:spPr>
+                </pic:pic>
+              </a:graphicData>
+            </a:graphic>
+          </wp:inline>
+        </w:drawing>
+      </w:r>
+    </w:p>
+    <w:p>
+      <w:pPr>
+        <w:spacing w:after="200" w:line="230"/>
+        <w:jc w:val="both"/>
+      </w:pPr>
+      <w:r>
+        <w:rPr>
+          <w:sz w:val="17"/>
+          <w:szCs w:val="17"/>
+        </w:rPr>
+        <w:t xml:space="preserve">Fig. 4. An abstention. None of the indexed agreements covers repeat unfair trade practice offences, so the model returns the abstention marker and no claim is shown.</w:t>
+      </w:r>
+    </w:p>
+    <w:p>
+      <w:pPr>
+        <w:keepNext/>
+        <w:spacing w:after="60" w:before="100"/>
+      </w:pPr>
+      <w:r>
+        <w:rPr>
+          <w:b/>
+          <w:bCs/>
+          <w:i/>
+          <w:iCs/>
+          <w:sz w:val="20"/>
+          <w:szCs w:val="20"/>
+        </w:rPr>
+        <w:t xml:space="preserve">6) Web interface</w:t>
+      </w:r>
+    </w:p>
+    <w:p>
+      <w:pPr>
+        <w:spacing w:after="120" w:line="250"/>
+        <w:jc w:val="both"/>
+      </w:pPr>
+      <w:r>
+        <w:rPr>
+          <w:sz w:val="20"/>
+          <w:szCs w:val="20"/>
+        </w:rPr>
+        <w:t xml:space="preserve">The system is used through a React web interface with five pages. </w:t>
+      </w:r>
+      <w:r>
+        <w:rPr>
+          <w:b/>
+          <w:bCs/>
+          <w:sz w:val="20"/>
+          <w:szCs w:val="20"/>
+        </w:rPr>
+        <w:t xml:space="preserve">Ingest</w:t>
+      </w:r>
+      <w:r>
+        <w:rPr>
+          <w:sz w:val="20"/>
+          <w:szCs w:val="20"/>
+        </w:rPr>
+        <w:t xml:space="preserve"> uploads a PDF or text file, reports how many chunks it produced and whether the paragraph fallback was used, and offers to replace a document that is already indexed. </w:t>
+      </w:r>
+      <w:r>
+        <w:rPr>
+          <w:b/>
+          <w:bCs/>
+          <w:sz w:val="20"/>
+          <w:szCs w:val="20"/>
+        </w:rPr>
+        <w:t xml:space="preserve">Ask</w:t>
+      </w:r>
+      <w:r>
+        <w:rPr>
+          <w:sz w:val="20"/>
+          <w:szCs w:val="20"/>
+        </w:rPr>
+        <w:t xml:space="preserve"> keeps saved conversations and shows every answer with its verdict, its score and clickable citations (Figs. 3 and 4). </w:t>
+      </w:r>
+      <w:r>
+        <w:rPr>
+          <w:b/>
+          <w:bCs/>
+          <w:sz w:val="20"/>
+          <w:szCs w:val="20"/>
+        </w:rPr>
+        <w:t xml:space="preserve">Search</w:t>
+      </w:r>
+      <w:r>
+        <w:rPr>
+          <w:sz w:val="20"/>
+          <w:szCs w:val="20"/>
+        </w:rPr>
+        <w:t xml:space="preserve"> runs one query through dense, keyword and hybrid retrieval side by side, so retrieval can be inspected before any generation. </w:t>
+      </w:r>
+      <w:r>
+        <w:rPr>
+          <w:b/>
+          <w:bCs/>
+          <w:sz w:val="20"/>
+          <w:szCs w:val="20"/>
+        </w:rPr>
+        <w:t xml:space="preserve">Evaluation</w:t>
+      </w:r>
+      <w:r>
+        <w:rPr>
+          <w:sz w:val="20"/>
+          <w:szCs w:val="20"/>
+        </w:rPr>
+        <w:t xml:space="preserve"> projects every indexed chunk to two dimensions with principal component analysis (PCA) and lists the metrics of each logged experiment (Fig. 5). </w:t>
+      </w:r>
+      <w:r>
+        <w:rPr>
+          <w:b/>
+          <w:bCs/>
+          <w:sz w:val="20"/>
+          <w:szCs w:val="20"/>
+        </w:rPr>
+        <w:t xml:space="preserve">Home</w:t>
+      </w:r>
+      <w:r>
+        <w:rPr>
+          <w:sz w:val="20"/>
+          <w:szCs w:val="20"/>
+        </w:rPr>
+        <w:t xml:space="preserve"> shows the size of the index. The pages talk to a FastAPI backend, and every step they show is also available as an API call.</w:t>
+      </w:r>
+    </w:p>
+    <w:p>
+      <w:pPr>
+        <w:keepNext/>
+        <w:spacing w:after="60" w:before="120"/>
+        <w:jc w:val="center"/>
+      </w:pPr>
+      <w:r>
+        <w:drawing>
+          <wp:inline distT="0" distB="0" distL="0" distR="0">
+            <wp:extent cx="2857500" cy="1400175"/>
+            <wp:effectExtent t="0" r="0" b="0" l="0"/>
+            <wp:docPr id="1" name="" descr="" title=""/>
+            <wp:cNvGraphicFramePr>
+              <a:graphicFrameLocks xmlns:a="http://schemas.openxmlformats.org/drawingml/2006/main" noChangeAspect="1"/>
+            </wp:cNvGraphicFramePr>
+            <a:graphic xmlns:a="http://schemas.openxmlformats.org/drawingml/2006/main">
+              <a:graphicData uri="http://schemas.openxmlformats.org/drawingml/2006/picture">
+                <pic:pic xmlns:pic="http://schemas.openxmlformats.org/drawingml/2006/picture">
+                  <pic:nvPicPr>
+                    <pic:cNvPr id="0" name="" descr=""/>
+                    <pic:cNvPicPr>
+                      <a:picLocks noChangeAspect="1" noChangeArrowheads="1"/>
+                    </pic:cNvPicPr>
+                  </pic:nvPicPr>
+                  <pic:blipFill>
+                    <a:blip r:embed="rId11" cstate="none"/>
+                    <a:srcRect/>
+                    <a:stretch>
+                      <a:fillRect/>
+                    </a:stretch>
+                  </pic:blipFill>
+                  <pic:spPr bwMode="auto">
+                    <a:xfrm>
+                      <a:off x="0" y="0"/>
+                      <a:ext cx="2857500" cy="1400175"/>
+                    </a:xfrm>
+                    <a:prstGeom prst="rect">
+                      <a:avLst/>
+                    </a:prstGeom>
+                  </pic:spPr>
+                </pic:pic>
+              </a:graphicData>
+            </a:graphic>
+          </wp:inline>
+        </w:drawing>
+      </w:r>
+    </w:p>
+    <w:p>
+      <w:pPr>
+        <w:spacing w:after="200" w:line="230"/>
+        <w:jc w:val="both"/>
+      </w:pPr>
+      <w:r>
+        <w:rPr>
+          <w:sz w:val="17"/>
+          <w:szCs w:val="17"/>
+        </w:rPr>
+        <w:t xml:space="preserve">Fig. 5. The Evaluation page’s view of the index: 695 chunks from eight documents, projected with PCA and coloured by document. The 412 chunks of the one document that is not an agreement form their own cluster; the seven agreements overlap.</w:t>
+      </w:r>
+    </w:p>
+    <w:p>
+      <w:pPr>
+        <w:spacing w:after="120" w:line="250"/>
+        <w:jc w:val="both"/>
+      </w:pPr>
+      <w:r>
+        <w:rPr>
+          <w:sz w:val="20"/>
+          <w:szCs w:val="20"/>
+        </w:rPr>
+        <w:t xml:space="preserve">The overlap in Fig. 5 is expected, since the agreements share most of their vocabulary, and it is the reason every chunk identifier names its source document. A question can retrieve a similar clause from the wrong contract, and the citation makes that visible to the reader.</w:t>
       </w:r>
     </w:p>
     <w:p>
@@ -3774,7 +4017,7 @@
           <w:sz w:val="20"/>
           <w:szCs w:val="20"/>
         </w:rPr>
-        <w:t xml:space="preserve">SAC reached a precision of 0.280 and an F1 of 0.417 in three of the four retrieval settings, against 0.200 and 0.333 for paragraph chunking in every setting (Table I, Fig. 4). Recall was at or near 1.000 throughout, so the gap comes from precision. Part of it is granularity: precision at a fixed </w:t>
+        <w:t xml:space="preserve">SAC reached a precision of 0.280 and an F1 of 0.417 in three of the four retrieval settings, against 0.200 and 0.333 for paragraph chunking in every setting (Table I, Fig. 6). Recall was at or near 1.000 throughout, so the gap comes from precision. Part of it is granularity: precision at a fixed </w:t>
       </w:r>
       <w:r>
         <w:rPr>
@@ -3831,7 +4074,7 @@
                     </pic:cNvPicPr>
                   </pic:nvPicPr>
                   <pic:blipFill>
-                    <a:blip r:embed="rId10" cstate="none"/>
+                    <a:blip r:embed="rId12" cstate="none"/>
                     <a:srcRect/>
                     <a:stretch>
                       <a:fillRect/>
@@ -3863,7 +4106,7 @@
           <w:sz w:val="17"/>
           <w:szCs w:val="17"/>
         </w:rPr>
-        <w:t xml:space="preserve">Fig. 4. Retrieval F1 for SAC and paragraph chunking under each retrieval setting.</w:t>
+        <w:t xml:space="preserve">Fig. 6. Retrieval F1 for SAC and paragraph chunking under each retrieval setting.</w:t>
       </w:r>
     </w:p>
     <w:p>
@@ -5242,7 +5485,7 @@
           <w:sz w:val="20"/>
           <w:szCs w:val="20"/>
         </w:rPr>
-        <w:t xml:space="preserve">The full chain showed none of the 28 corrupted claims, and neither did any arm with a single detector removed. Removing V5 showed all 28 (Fig. 5). Without the gate, the detectors still scored every corrupted claim at zero, but a score changes nothing for the user unless something acts on it. The detectors also overlap. With V1 removed, a fabricated citation still scored zero, because V2 found no premise to test and V3’s fidelity collapsed. V1’s distinct contribution is diagnostic: it is the only layer that names the missing identifiers in the proof. On clean input, V2 moved decisions the most; without it, one more question was answered and the mean VCS rose from 0.768 to 0.813. V6 changes no score by design.</w:t>
+        <w:t xml:space="preserve">The full chain showed none of the 28 corrupted claims, and neither did any arm with a single detector removed. Removing V5 showed all 28 (Fig. 7). Without the gate, the detectors still scored every corrupted claim at zero, but a score changes nothing for the user unless something acts on it. The detectors also overlap. With V1 removed, a fabricated citation still scored zero, because V2 found no premise to test and V3’s fidelity collapsed. V1’s distinct contribution is diagnostic: it is the only layer that names the missing identifiers in the proof. On clean input, V2 moved decisions the most; without it, one more question was answered and the mean VCS rose from 0.768 to 0.813. V6 changes no score by design.</w:t>
       </w:r>
     </w:p>
     <w:p>
@@ -5270,7 +5513,7 @@
                     </pic:cNvPicPr>
                   </pic:nvPicPr>
                   <pic:blipFill>
-                    <a:blip r:embed="rId11" cstate="none"/>
+                    <a:blip r:embed="rId13" cstate="none"/>
                     <a:srcRect/>
                     <a:stretch>
                       <a:fillRect/>
@@ -5302,7 +5545,7 @@
           <w:sz w:val="17"/>
           <w:szCs w:val="17"/>
         </w:rPr>
-        <w:t xml:space="preserve">Fig. 5. Corrupted claims shown to the user when each layer is removed (28 in total). Only removing the V5 gate lets them through.</w:t>
+        <w:t xml:space="preserve">Fig. 7. Corrupted claims shown to the user when each layer is removed (28 in total). Only removing the V5 gate lets them through.</w:t>
       </w:r>
     </w:p>
     <w:p>
@@ -5376,6 +5619,19 @@
     </w:p>
     <w:p>
       <w:pPr>
+        <w:spacing w:after="120" w:line="250"/>
+        <w:jc w:val="both"/>
+      </w:pPr>
+      <w:r>
+        <w:rPr>
+          <w:sz w:val="20"/>
+          <w:szCs w:val="20"/>
+        </w:rPr>
+        <w:t xml:space="preserve">Fig. 3 exposes a weakness of averaging. The answer’s VCS of 0.62 is the mean of two claim scores, and the first claim contributes 1.00, so the second scored below 0.25. It was shown only because a strong claim sat next to it. Gating each claim on its own score would have withheld it.</w:t>
+      </w:r>
+    </w:p>
+    <w:p>
+      <w:pPr>
         <w:keepNext/>
         <w:spacing w:after="120" w:before="240"/>
       </w:pPr>
@@ -5443,7 +5699,7 @@
           <w:sz w:val="20"/>
           <w:szCs w:val="20"/>
         </w:rPr>
-        <w:t xml:space="preserve">Figs. 4 and 5 were plotted with Matplotlib directly from the result files logged for each experiment, and every number in Tables I and II comes from those files. Figs. 1 and 2 were drawn for this paper, and Fig. 3 is a screenshot of the web interface during a real query.</w:t>
+        <w:t xml:space="preserve">Figs. 6 and 7 were plotted with Matplotlib directly from the result files logged for each experiment, and every number in Tables I and II comes from those files. Figs. 1 and 2 were drawn for this paper, and Figs. 3–5 are screenshots of the web interface taken during real use.</w:t>
       </w:r>
     </w:p>
     <w:p>
@@ -5613,6 +5869,33 @@
           <w:sz w:val="20"/>
           <w:szCs w:val="20"/>
         </w:rPr>
+        <w:t xml:space="preserve">Mean aggregation:</w:t>
+      </w:r>
+      <w:r>
+        <w:rPr>
+          <w:sz w:val="20"/>
+          <w:szCs w:val="20"/>
+        </w:rPr>
+        <w:t xml:space="preserve"> averaging lets a weak claim through when it sits next to a strong one, as in Fig. 3.</w:t>
+      </w:r>
+    </w:p>
+    <w:p>
+      <w:pPr>
+        <w:pStyle w:val="ListParagraph"/>
+        <w:numPr>
+          <w:ilvl w:val="0"/>
+          <w:numId w:val="3"/>
+        </w:numPr>
+        <w:spacing w:after="80" w:line="250"/>
+        <w:jc w:val="both"/>
+      </w:pPr>
+      <w:r>
+        <w:rPr>
+          <w:b/>
+          <w:bCs/>
+          <w:sz w:val="20"/>
+          <w:szCs w:val="20"/>
+        </w:rPr>
         <w:t xml:space="preserve">Latency and quotas:</w:t>
       </w:r>
       <w:r>
@@ -5636,6 +5919,24 @@
           <w:szCs w:val="26"/>
         </w:rPr>
         <w:t xml:space="preserve">VI. FUTURE ENHANCEMENTS</w:t>
+      </w:r>
+    </w:p>
+    <w:p>
+      <w:pPr>
+        <w:pStyle w:val="ListParagraph"/>
+        <w:numPr>
+          <w:ilvl w:val="0"/>
+          <w:numId w:val="3"/>
+        </w:numPr>
+        <w:spacing w:after="80" w:line="250"/>
+        <w:jc w:val="both"/>
+      </w:pPr>
+      <w:r>
+        <w:rPr>
+          <w:sz w:val="20"/>
+          <w:szCs w:val="20"/>
+        </w:rPr>
+        <w:t xml:space="preserve">Gate each claim on its own score, or aggregate with the minimum instead of the mean, so one strong claim cannot carry a weak one.</w:t>
       </w:r>
     </w:p>
     <w:p>

</xml_diff>

<commit_message>
Complete paper references and experimental setup
</commit_message>
<xml_diff>
--- a/docs/paper/paper.docx
+++ b/docs/paper/paper.docx
@@ -893,7 +893,7 @@
           <w:sz w:val="20"/>
           <w:szCs w:val="20"/>
         </w:rPr>
-        <w:t xml:space="preserve">When a document has a recognisable Act, Chapter, Section and Clause hierarchy, it is split along that hierarchy using summary-augmented chunking. Each chunk is embedded together with a short summary of the section it belongs to, so a clause such as “within thirty days” is not retrieved without the section that says what the thirty days apply to. Contracts rarely have this structure, so the system falls back to paragraph chunking and records which strategy it used.</w:t>
+        <w:t xml:space="preserve">When a document has a recognisable Act, Chapter, Section and Clause hierarchy, it is split along that hierarchy using summary-augmented chunking. Each chunk is embedded together with a short summary of the section it belongs to, so a clause such as “within thirty days” is not retrieved without the section that says what the thirty days apply to. The original method [4] prepends an LLM-written summary of the whole document; our summary is extractive and section-level (the section heading and its first sentence), so ingestion needs no model call. Contracts rarely have this structure, so the system falls back to paragraph chunking and records which strategy it used.</w:t>
       </w:r>
     </w:p>
     <w:p>
@@ -2015,22 +2015,7 @@
           <w:sz w:val="20"/>
           <w:szCs w:val="20"/>
         </w:rPr>
-        <w:t xml:space="preserve"> Python </w:t>
-      </w:r>
-      <w:r>
-        <w:rPr>
-          <w:sz w:val="20"/>
-          <w:szCs w:val="20"/>
-          <w:shd w:fill="FFF176" w:color="auto" w:val="clear"/>
-        </w:rPr>
-        <w:t xml:space="preserve">[3.11 — confirm]</w:t>
-      </w:r>
-      <w:r>
-        <w:rPr>
-          <w:sz w:val="20"/>
-          <w:szCs w:val="20"/>
-        </w:rPr>
-        <w:t xml:space="preserve">, LanceDB, sentence-transformers, Hugging Face Transformers, FastAPI and React.</w:t>
+        <w:t xml:space="preserve"> Python 3.11, LanceDB, sentence-transformers, Hugging Face Transformers, FastAPI and React. The pipeline is written directly in Python, without an orchestration framework such as LangChain.</w:t>
       </w:r>
     </w:p>
     <w:p>
@@ -2057,7 +2042,7 @@
           <w:sz w:val="20"/>
           <w:szCs w:val="20"/>
         </w:rPr>
-        <w:t xml:space="preserve"> all-MiniLM-L6-v2 (embeddings), BAAI/bge-reranker-base (reranking), roberta-large-mnli (entailment) and gemini-flash-lite-latest (generation in the ablation runs).</w:t>
+        <w:t xml:space="preserve"> all-MiniLM-L6-v2 (embeddings), BAAI/bge-reranker-base (reranking), roberta-large-mnli (entailment), gemini-flash-lite-latest (generation in the ablation runs and the batch test) and openai/gpt-oss-120b served through Groq (generation in the web interface).</w:t>
       </w:r>
     </w:p>
     <w:p>
@@ -2117,48 +2102,6 @@
           <w:szCs w:val="20"/>
         </w:rPr>
         <w:t xml:space="preserve"> = 50, τ = 0.60, weights 0.40 / 0.35 / 0.25.</w:t>
-      </w:r>
-    </w:p>
-    <w:p>
-      <w:pPr>
-        <w:pStyle w:val="ListParagraph"/>
-        <w:numPr>
-          <w:ilvl w:val="0"/>
-          <w:numId w:val="3"/>
-        </w:numPr>
-        <w:spacing w:after="80" w:line="250"/>
-        <w:jc w:val="both"/>
-      </w:pPr>
-      <w:r>
-        <w:rPr>
-          <w:b/>
-          <w:bCs/>
-          <w:sz w:val="20"/>
-          <w:szCs w:val="20"/>
-        </w:rPr>
-        <w:t xml:space="preserve">Hardware:</w:t>
-      </w:r>
-      <w:r>
-        <w:rPr>
-          <w:sz w:val="20"/>
-          <w:szCs w:val="20"/>
-        </w:rPr>
-        <w:t xml:space="preserve"> </w:t>
-      </w:r>
-      <w:r>
-        <w:rPr>
-          <w:sz w:val="20"/>
-          <w:szCs w:val="20"/>
-          <w:shd w:fill="FFF176" w:color="auto" w:val="clear"/>
-        </w:rPr>
-        <w:t xml:space="preserve">[laptop CPU, RAM, GPU if any, operating system]</w:t>
-      </w:r>
-      <w:r>
-        <w:rPr>
-          <w:sz w:val="20"/>
-          <w:szCs w:val="20"/>
-        </w:rPr>
-        <w:t xml:space="preserve">.</w:t>
       </w:r>
     </w:p>
     <w:p>
@@ -6170,7 +6113,7 @@
           <w:sz w:val="16"/>
           <w:szCs w:val="16"/>
         </w:rPr>
-        <w:t xml:space="preserve">[4] Reuter, et al. (2025). </w:t>
+        <w:t xml:space="preserve">[4] Reuter, M., Lingenberg, T., Liepina, R., Lagioia, F., Lippi, M., Sartor, G., Passerini, A., &amp; Sayin, B. (2025). </w:t>
       </w:r>
       <w:r>
         <w:rPr>
@@ -6186,28 +6129,20 @@
           <w:sz w:val="16"/>
           <w:szCs w:val="16"/>
         </w:rPr>
-        <w:t xml:space="preserve"> Natural Legal Language Processing Workshop (NLLP). </w:t>
-      </w:r>
+        <w:t xml:space="preserve"> Proceedings of the Natural Legal Language Processing Workshop (NLLP), pp. 17–30.</w:t>
+      </w:r>
+    </w:p>
+    <w:p>
+      <w:pPr>
+        <w:spacing w:after="60" w:line="250"/>
+        <w:jc w:val="left"/>
+      </w:pPr>
       <w:r>
         <w:rPr>
           <w:sz w:val="16"/>
           <w:szCs w:val="16"/>
-          <w:shd w:fill="FFF176" w:color="auto" w:val="clear"/>
-        </w:rPr>
-        <w:t xml:space="preserve">[verify author initials]</w:t>
-      </w:r>
-    </w:p>
-    <w:p>
-      <w:pPr>
-        <w:spacing w:after="60" w:line="250"/>
-        <w:jc w:val="left"/>
-      </w:pPr>
-      <w:r>
-        <w:rPr>
-          <w:sz w:val="16"/>
-          <w:szCs w:val="16"/>
-        </w:rPr>
-        <w:t xml:space="preserve">[5] Figueiredo, et al. (2026). </w:t>
+        </w:rPr>
+        <w:t xml:space="preserve">[5] Figueiredo, A., Lucas, J., Ribeiro, T., et al. (2026). </w:t>
       </w:r>
       <w:r>
         <w:rPr>
@@ -6216,35 +6151,27 @@
           <w:sz w:val="16"/>
           <w:szCs w:val="16"/>
         </w:rPr>
-        <w:t xml:space="preserve">Grounded in Law.</w:t>
+        <w:t xml:space="preserve">Grounded in Law: A Multi-Stage Anti-Hallucination Pipeline for Legal RAG Systems in Brazilian Portuguese.</w:t>
       </w:r>
       <w:r>
         <w:rPr>
           <w:sz w:val="16"/>
           <w:szCs w:val="16"/>
         </w:rPr>
-        <w:t xml:space="preserve"> International Conference on Computational Processing of Portuguese (PROPOR). </w:t>
-      </w:r>
+        <w:t xml:space="preserve"> Proceedings of the 17th International Conference on Computational Processing of Portuguese (PROPOR).</w:t>
+      </w:r>
+    </w:p>
+    <w:p>
+      <w:pPr>
+        <w:spacing w:after="60" w:line="250"/>
+        <w:jc w:val="left"/>
+      </w:pPr>
       <w:r>
         <w:rPr>
           <w:sz w:val="16"/>
           <w:szCs w:val="16"/>
-          <w:shd w:fill="FFF176" w:color="auto" w:val="clear"/>
-        </w:rPr>
-        <w:t xml:space="preserve">[verify full title and authors]</w:t>
-      </w:r>
-    </w:p>
-    <w:p>
-      <w:pPr>
-        <w:spacing w:after="60" w:line="250"/>
-        <w:jc w:val="left"/>
-      </w:pPr>
-      <w:r>
-        <w:rPr>
-          <w:sz w:val="16"/>
-          <w:szCs w:val="16"/>
-        </w:rPr>
-        <w:t xml:space="preserve">[6] Maghakian, et al. (2025). </w:t>
+        </w:rPr>
+        <w:t xml:space="preserve">[6] Maghakian, J., Sinha, R., Schettewi, M., &amp; Kaur, G. (2025). </w:t>
       </w:r>
       <w:r>
         <w:rPr>
@@ -6260,15 +6187,7 @@
           <w:sz w:val="16"/>
           <w:szCs w:val="16"/>
         </w:rPr>
-        <w:t xml:space="preserve"> Conference on Empirical Methods in Natural Language Processing (EMNLP). </w:t>
-      </w:r>
-      <w:r>
-        <w:rPr>
-          <w:sz w:val="16"/>
-          <w:szCs w:val="16"/>
-          <w:shd w:fill="FFF176" w:color="auto" w:val="clear"/>
-        </w:rPr>
-        <w:t xml:space="preserve">[verify full title and authors]</w:t>
+        <w:t xml:space="preserve"> Findings of the Association for Computational Linguistics: EMNLP 2025, pp. 24974–24985.</w:t>
       </w:r>
     </w:p>
     <w:p>

</xml_diff>

<commit_message>
Describe the LangChain implementation and its equivalence check in the paper
</commit_message>
<xml_diff>
--- a/docs/paper/paper.docx
+++ b/docs/paper/paper.docx
@@ -1855,6 +1855,36 @@
     <w:p>
       <w:pPr>
         <w:keepNext/>
+        <w:spacing w:after="60" w:before="100"/>
+      </w:pPr>
+      <w:r>
+        <w:rPr>
+          <w:b/>
+          <w:bCs/>
+          <w:i/>
+          <w:iCs/>
+          <w:sz w:val="20"/>
+          <w:szCs w:val="20"/>
+        </w:rPr>
+        <w:t xml:space="preserve">7) Implementation</w:t>
+      </w:r>
+    </w:p>
+    <w:p>
+      <w:pPr>
+        <w:spacing w:after="120" w:line="250"/>
+        <w:jc w:val="both"/>
+      </w:pPr>
+      <w:r>
+        <w:rPr>
+          <w:sz w:val="20"/>
+          <w:szCs w:val="20"/>
+        </w:rPr>
+        <w:t xml:space="preserve">Loading, retrieval and generation are composed with LangChain [19]; section-aware chunking and the six-layer verification chain are our own Python code. Against a plain-Python implementation of the same pipeline, the LangChain version returned identical top-5 retrieval rankings on all 10 labelled queries, with F1 0.417 and recall 1.00 for both. Replaying the same cached model answers through both, it reached identical verification decisions and scores on all 10, and neither surfaced any of 28 deliberately corrupted claims. Mean query latency differed by 4.6%, within the variation of the LLM calls.</w:t>
+      </w:r>
+    </w:p>
+    <w:p>
+      <w:pPr>
+        <w:keepNext/>
         <w:spacing w:after="80" w:before="160"/>
       </w:pPr>
       <w:r>
@@ -2015,7 +2045,7 @@
           <w:sz w:val="20"/>
           <w:szCs w:val="20"/>
         </w:rPr>
-        <w:t xml:space="preserve"> Python 3.11, LanceDB, sentence-transformers, Hugging Face Transformers, FastAPI and React. The pipeline is written directly in Python, without an orchestration framework such as LangChain.</w:t>
+        <w:t xml:space="preserve"> Python 3.11, LangChain [19], LanceDB, sentence-transformers, Hugging Face Transformers, FastAPI and React.</w:t>
       </w:r>
     </w:p>
     <w:p>
@@ -6536,6 +6566,35 @@
           <w:szCs w:val="16"/>
         </w:rPr>
         <w:t xml:space="preserve"> Conference on Empirical Methods in Natural Language Processing (EMNLP).</w:t>
+      </w:r>
+    </w:p>
+    <w:p>
+      <w:pPr>
+        <w:spacing w:after="60" w:line="250"/>
+        <w:jc w:val="left"/>
+      </w:pPr>
+      <w:r>
+        <w:rPr>
+          <w:sz w:val="16"/>
+          <w:szCs w:val="16"/>
+        </w:rPr>
+        <w:t xml:space="preserve">[19] Chase, H. (2022). </w:t>
+      </w:r>
+      <w:r>
+        <w:rPr>
+          <w:i/>
+          <w:iCs/>
+          <w:sz w:val="16"/>
+          <w:szCs w:val="16"/>
+        </w:rPr>
+        <w:t xml:space="preserve">LangChain</w:t>
+      </w:r>
+      <w:r>
+        <w:rPr>
+          <w:sz w:val="16"/>
+          <w:szCs w:val="16"/>
+        </w:rPr>
+        <w:t xml:space="preserve"> [Computer software]. https://github.com/langchain-ai/langchain.</w:t>
       </w:r>
     </w:p>
     <w:sectPr>

</xml_diff>

<commit_message>
Add the end-to-end interface test to the paper
</commit_message>
<xml_diff>
--- a/docs/paper/paper.docx
+++ b/docs/paper/paper.docx
@@ -586,7 +586,7 @@
           <w:sz w:val="20"/>
           <w:szCs w:val="20"/>
         </w:rPr>
-        <w:t xml:space="preserve">, while removing any single detection layer showed none. The same tests produced three false abstentions in ten answerable questions, which makes calibrating the gate the main open problem.</w:t>
+        <w:t xml:space="preserve">, while removing any single detection layer showed none. The same tests produced three false abstentions in ten answerable questions. In an end-to-end test through the web interface, with five real documents and 15 questions whose answers were fixed in advance, no wrong answer was shown as verified; the main failure was false abstention (4 of 15), and two of those cases were parser bugs that we then fixed. Calibrating the gate remains the main open problem.</w:t>
       </w:r>
     </w:p>
     <w:p>
@@ -732,7 +732,7 @@
           <w:sz w:val="20"/>
           <w:szCs w:val="20"/>
         </w:rPr>
-        <w:t xml:space="preserve">An ablation study that removes one layer at a time and shows that the gate, not any single detector, is what keeps bad claims away from the user.</w:t>
+        <w:t xml:space="preserve">An ablation study that removes one layer at a time and shows that the gate, not any single detector, is what keeps bad claims away from the user, and an end-to-end test through the interface with answers fixed before the run.</w:t>
       </w:r>
     </w:p>
     <w:p>
@@ -2158,7 +2158,7 @@
           <w:sz w:val="20"/>
           <w:szCs w:val="20"/>
         </w:rPr>
-        <w:t xml:space="preserve"> each answer was generated once and every ablation arm was replayed on the cached answers, so the arms differ only in the layer removed. V4 ran on a five-question subset with two resamples each to stay within the free API quota.</w:t>
+        <w:t xml:space="preserve"> each answer was generated once and every ablation arm was replayed on the cached answers, so the arms differ only in the layer removed. V4 ran on a five-question subset with two resamples each to stay within the free API quota. The end-to-end test in Section III-E used Groq-hosted openai/gpt-oss-120b on the LangChain backend.</w:t>
       </w:r>
     </w:p>
     <w:p>
@@ -5561,7 +5561,7 @@
           <w:sz w:val="22"/>
           <w:szCs w:val="22"/>
         </w:rPr>
-        <w:t xml:space="preserve">D. Behaviour on Real Documents</w:t>
+        <w:t xml:space="preserve">D. Batch Test on Real Contracts</w:t>
       </w:r>
     </w:p>
     <w:p>
@@ -5601,6 +5601,859 @@
           <w:szCs w:val="20"/>
         </w:rPr>
         <w:t xml:space="preserve">Fig. 3 exposes a weakness of averaging. The answer’s VCS of 0.62 is the mean of two claim scores, and the first claim contributes 1.00, so the second scored below 0.25. It was shown only because a strong claim sat next to it. Gating each claim on its own score would have withheld it.</w:t>
+      </w:r>
+    </w:p>
+    <w:p>
+      <w:pPr>
+        <w:keepNext/>
+        <w:spacing w:after="80" w:before="160"/>
+      </w:pPr>
+      <w:r>
+        <w:rPr>
+          <w:b/>
+          <w:bCs/>
+          <w:sz w:val="22"/>
+          <w:szCs w:val="22"/>
+        </w:rPr>
+        <w:t xml:space="preserve">E. End-to-End Test Through the Interface</w:t>
+      </w:r>
+    </w:p>
+    <w:p>
+      <w:pPr>
+        <w:spacing w:after="120" w:line="250"/>
+        <w:jc w:val="both"/>
+      </w:pPr>
+      <w:r>
+        <w:rPr>
+          <w:sz w:val="20"/>
+          <w:szCs w:val="20"/>
+        </w:rPr>
+        <w:t xml:space="preserve">The earlier tests call the pipeline directly. To see what a user experiences, we used the web interface as a person would: every upload, question and click was a real browser action driven by Playwright, against the LangChain backend on a fresh index. We indexed five documents: three non-disclosure agreements from ContractNLI, a non-competition agreement from CUAD, and one of our synthetic statutes, the only one with section structure that exercises SAC. Before indexing anything, we read the documents and wrote 15 questions, each with its expected behaviour, expected answer and source passage, and committed them to the repository so they could not be adjusted afterwards. The questions covered six categories: five about a specific fact, two comparing documents, three the documents cannot answer, two general legal concepts, two with a false premise, and one paraphrase with none of the source’s keywords. Each answer was then compared with its expected answer and the cited passage and labelled (Table III).</w:t>
+      </w:r>
+    </w:p>
+    <w:p>
+      <w:pPr>
+        <w:keepNext/>
+        <w:spacing w:after="80" w:before="160"/>
+        <w:jc w:val="center"/>
+      </w:pPr>
+      <w:r>
+        <w:rPr>
+          <w:sz w:val="17"/>
+          <w:szCs w:val="17"/>
+        </w:rPr>
+        <w:t xml:space="preserve">TABLE III. End-to-end test: 15 questions with answers fixed in advance. “After” re-asks the three questions affected by the fixes.</w:t>
+      </w:r>
+    </w:p>
+    <w:tbl>
+      <w:tblPr>
+        <w:tblW w:type="dxa" w:w="4900"/>
+        <w:tblBorders>
+          <w:top w:val="single" w:color="auto" w:sz="4"/>
+          <w:left w:val="single" w:color="auto" w:sz="4"/>
+          <w:bottom w:val="single" w:color="auto" w:sz="4"/>
+          <w:right w:val="single" w:color="auto" w:sz="4"/>
+          <w:insideH w:val="single" w:color="auto" w:sz="4"/>
+          <w:insideV w:val="single" w:color="auto" w:sz="4"/>
+        </w:tblBorders>
+      </w:tblPr>
+      <w:tblGrid>
+        <w:gridCol w:w="2300"/>
+        <w:gridCol w:w="1300"/>
+        <w:gridCol w:w="1300"/>
+      </w:tblGrid>
+      <w:tr>
+        <w:trPr>
+          <w:tblHeader/>
+        </w:trPr>
+        <w:tc>
+          <w:tcPr>
+            <w:tcW w:type="dxa" w:w="2300"/>
+            <w:tcBorders>
+              <w:top w:val="single" w:color="000000" w:sz="4"/>
+              <w:left w:val="none" w:color="FFFFFF" w:sz="0"/>
+              <w:bottom w:val="single" w:color="000000" w:sz="4"/>
+              <w:right w:val="none" w:color="FFFFFF" w:sz="0"/>
+            </w:tcBorders>
+            <w:tcMar>
+              <w:top w:type="dxa" w:w="30"/>
+              <w:left w:type="dxa" w:w="60"/>
+              <w:bottom w:type="dxa" w:w="30"/>
+              <w:right w:type="dxa" w:w="60"/>
+            </w:tcMar>
+            <w:vAlign w:val="center"/>
+          </w:tcPr>
+          <w:p>
+            <w:pPr>
+              <w:jc w:val="left"/>
+            </w:pPr>
+            <w:r>
+              <w:rPr>
+                <w:b/>
+                <w:bCs/>
+                <w:sz w:val="16"/>
+                <w:szCs w:val="16"/>
+              </w:rPr>
+              <w:t xml:space="preserve">Outcome</w:t>
+            </w:r>
+          </w:p>
+        </w:tc>
+        <w:tc>
+          <w:tcPr>
+            <w:tcW w:type="dxa" w:w="1300"/>
+            <w:tcBorders>
+              <w:top w:val="single" w:color="000000" w:sz="4"/>
+              <w:left w:val="none" w:color="FFFFFF" w:sz="0"/>
+              <w:bottom w:val="single" w:color="000000" w:sz="4"/>
+              <w:right w:val="none" w:color="FFFFFF" w:sz="0"/>
+            </w:tcBorders>
+            <w:tcMar>
+              <w:top w:type="dxa" w:w="30"/>
+              <w:left w:type="dxa" w:w="60"/>
+              <w:bottom w:type="dxa" w:w="30"/>
+              <w:right w:type="dxa" w:w="60"/>
+            </w:tcMar>
+            <w:vAlign w:val="center"/>
+          </w:tcPr>
+          <w:p>
+            <w:pPr>
+              <w:jc w:val="center"/>
+            </w:pPr>
+            <w:r>
+              <w:rPr>
+                <w:b/>
+                <w:bCs/>
+                <w:sz w:val="16"/>
+                <w:szCs w:val="16"/>
+              </w:rPr>
+              <w:t xml:space="preserve">Before fixes</w:t>
+            </w:r>
+          </w:p>
+        </w:tc>
+        <w:tc>
+          <w:tcPr>
+            <w:tcW w:type="dxa" w:w="1300"/>
+            <w:tcBorders>
+              <w:top w:val="single" w:color="000000" w:sz="4"/>
+              <w:left w:val="none" w:color="FFFFFF" w:sz="0"/>
+              <w:bottom w:val="single" w:color="000000" w:sz="4"/>
+              <w:right w:val="none" w:color="FFFFFF" w:sz="0"/>
+            </w:tcBorders>
+            <w:tcMar>
+              <w:top w:type="dxa" w:w="30"/>
+              <w:left w:type="dxa" w:w="60"/>
+              <w:bottom w:type="dxa" w:w="30"/>
+              <w:right w:type="dxa" w:w="60"/>
+            </w:tcMar>
+            <w:vAlign w:val="center"/>
+          </w:tcPr>
+          <w:p>
+            <w:pPr>
+              <w:jc w:val="center"/>
+            </w:pPr>
+            <w:r>
+              <w:rPr>
+                <w:b/>
+                <w:bCs/>
+                <w:sz w:val="16"/>
+                <w:szCs w:val="16"/>
+              </w:rPr>
+              <w:t xml:space="preserve">After fixes</w:t>
+            </w:r>
+          </w:p>
+        </w:tc>
+      </w:tr>
+      <w:tr>
+        <w:tc>
+          <w:tcPr>
+            <w:tcW w:type="dxa" w:w="2300"/>
+            <w:tcBorders>
+              <w:top w:val="none" w:color="FFFFFF" w:sz="0"/>
+              <w:left w:val="none" w:color="FFFFFF" w:sz="0"/>
+              <w:bottom w:val="none" w:color="FFFFFF" w:sz="0"/>
+              <w:right w:val="none" w:color="FFFFFF" w:sz="0"/>
+            </w:tcBorders>
+            <w:tcMar>
+              <w:top w:type="dxa" w:w="30"/>
+              <w:left w:type="dxa" w:w="60"/>
+              <w:bottom w:type="dxa" w:w="30"/>
+              <w:right w:type="dxa" w:w="60"/>
+            </w:tcMar>
+            <w:vAlign w:val="center"/>
+          </w:tcPr>
+          <w:p>
+            <w:pPr>
+              <w:jc w:val="left"/>
+            </w:pPr>
+            <w:r>
+              <w:rPr>
+                <w:b w:val="false"/>
+                <w:bCs w:val="false"/>
+                <w:sz w:val="16"/>
+                <w:szCs w:val="16"/>
+              </w:rPr>
+              <w:t xml:space="preserve">Correct, shown as verified</w:t>
+            </w:r>
+          </w:p>
+        </w:tc>
+        <w:tc>
+          <w:tcPr>
+            <w:tcW w:type="dxa" w:w="1300"/>
+            <w:tcBorders>
+              <w:top w:val="none" w:color="FFFFFF" w:sz="0"/>
+              <w:left w:val="none" w:color="FFFFFF" w:sz="0"/>
+              <w:bottom w:val="none" w:color="FFFFFF" w:sz="0"/>
+              <w:right w:val="none" w:color="FFFFFF" w:sz="0"/>
+            </w:tcBorders>
+            <w:tcMar>
+              <w:top w:type="dxa" w:w="30"/>
+              <w:left w:type="dxa" w:w="60"/>
+              <w:bottom w:type="dxa" w:w="30"/>
+              <w:right w:type="dxa" w:w="60"/>
+            </w:tcMar>
+            <w:vAlign w:val="center"/>
+          </w:tcPr>
+          <w:p>
+            <w:pPr>
+              <w:jc w:val="center"/>
+            </w:pPr>
+            <w:r>
+              <w:rPr>
+                <w:b w:val="false"/>
+                <w:bCs w:val="false"/>
+                <w:sz w:val="16"/>
+                <w:szCs w:val="16"/>
+              </w:rPr>
+              <w:t xml:space="preserve">3</w:t>
+            </w:r>
+          </w:p>
+        </w:tc>
+        <w:tc>
+          <w:tcPr>
+            <w:tcW w:type="dxa" w:w="1300"/>
+            <w:tcBorders>
+              <w:top w:val="none" w:color="FFFFFF" w:sz="0"/>
+              <w:left w:val="none" w:color="FFFFFF" w:sz="0"/>
+              <w:bottom w:val="none" w:color="FFFFFF" w:sz="0"/>
+              <w:right w:val="none" w:color="FFFFFF" w:sz="0"/>
+            </w:tcBorders>
+            <w:tcMar>
+              <w:top w:type="dxa" w:w="30"/>
+              <w:left w:type="dxa" w:w="60"/>
+              <w:bottom w:type="dxa" w:w="30"/>
+              <w:right w:type="dxa" w:w="60"/>
+            </w:tcMar>
+            <w:vAlign w:val="center"/>
+          </w:tcPr>
+          <w:p>
+            <w:pPr>
+              <w:jc w:val="center"/>
+            </w:pPr>
+            <w:r>
+              <w:rPr>
+                <w:b w:val="false"/>
+                <w:bCs w:val="false"/>
+                <w:sz w:val="16"/>
+                <w:szCs w:val="16"/>
+              </w:rPr>
+              <w:t xml:space="preserve">4</w:t>
+            </w:r>
+          </w:p>
+        </w:tc>
+      </w:tr>
+      <w:tr>
+        <w:tc>
+          <w:tcPr>
+            <w:tcW w:type="dxa" w:w="2300"/>
+            <w:tcBorders>
+              <w:top w:val="none" w:color="FFFFFF" w:sz="0"/>
+              <w:left w:val="none" w:color="FFFFFF" w:sz="0"/>
+              <w:bottom w:val="none" w:color="FFFFFF" w:sz="0"/>
+              <w:right w:val="none" w:color="FFFFFF" w:sz="0"/>
+            </w:tcBorders>
+            <w:tcMar>
+              <w:top w:type="dxa" w:w="30"/>
+              <w:left w:type="dxa" w:w="60"/>
+              <w:bottom w:type="dxa" w:w="30"/>
+              <w:right w:type="dxa" w:w="60"/>
+            </w:tcMar>
+            <w:vAlign w:val="center"/>
+          </w:tcPr>
+          <w:p>
+            <w:pPr>
+              <w:jc w:val="left"/>
+            </w:pPr>
+            <w:r>
+              <w:rPr>
+                <w:b/>
+                <w:bCs/>
+                <w:sz w:val="16"/>
+                <w:szCs w:val="16"/>
+              </w:rPr>
+              <w:t xml:space="preserve">Wrong, shown as verified</w:t>
+            </w:r>
+          </w:p>
+        </w:tc>
+        <w:tc>
+          <w:tcPr>
+            <w:tcW w:type="dxa" w:w="1300"/>
+            <w:tcBorders>
+              <w:top w:val="none" w:color="FFFFFF" w:sz="0"/>
+              <w:left w:val="none" w:color="FFFFFF" w:sz="0"/>
+              <w:bottom w:val="none" w:color="FFFFFF" w:sz="0"/>
+              <w:right w:val="none" w:color="FFFFFF" w:sz="0"/>
+            </w:tcBorders>
+            <w:tcMar>
+              <w:top w:type="dxa" w:w="30"/>
+              <w:left w:type="dxa" w:w="60"/>
+              <w:bottom w:type="dxa" w:w="30"/>
+              <w:right w:type="dxa" w:w="60"/>
+            </w:tcMar>
+            <w:vAlign w:val="center"/>
+          </w:tcPr>
+          <w:p>
+            <w:pPr>
+              <w:jc w:val="center"/>
+            </w:pPr>
+            <w:r>
+              <w:rPr>
+                <w:b/>
+                <w:bCs/>
+                <w:sz w:val="16"/>
+                <w:szCs w:val="16"/>
+              </w:rPr>
+              <w:t xml:space="preserve">0</w:t>
+            </w:r>
+          </w:p>
+        </w:tc>
+        <w:tc>
+          <w:tcPr>
+            <w:tcW w:type="dxa" w:w="1300"/>
+            <w:tcBorders>
+              <w:top w:val="none" w:color="FFFFFF" w:sz="0"/>
+              <w:left w:val="none" w:color="FFFFFF" w:sz="0"/>
+              <w:bottom w:val="none" w:color="FFFFFF" w:sz="0"/>
+              <w:right w:val="none" w:color="FFFFFF" w:sz="0"/>
+            </w:tcBorders>
+            <w:tcMar>
+              <w:top w:type="dxa" w:w="30"/>
+              <w:left w:type="dxa" w:w="60"/>
+              <w:bottom w:type="dxa" w:w="30"/>
+              <w:right w:type="dxa" w:w="60"/>
+            </w:tcMar>
+            <w:vAlign w:val="center"/>
+          </w:tcPr>
+          <w:p>
+            <w:pPr>
+              <w:jc w:val="center"/>
+            </w:pPr>
+            <w:r>
+              <w:rPr>
+                <w:b/>
+                <w:bCs/>
+                <w:sz w:val="16"/>
+                <w:szCs w:val="16"/>
+              </w:rPr>
+              <w:t xml:space="preserve">0</w:t>
+            </w:r>
+          </w:p>
+        </w:tc>
+      </w:tr>
+      <w:tr>
+        <w:tc>
+          <w:tcPr>
+            <w:tcW w:type="dxa" w:w="2300"/>
+            <w:tcBorders>
+              <w:top w:val="none" w:color="FFFFFF" w:sz="0"/>
+              <w:left w:val="none" w:color="FFFFFF" w:sz="0"/>
+              <w:bottom w:val="none" w:color="FFFFFF" w:sz="0"/>
+              <w:right w:val="none" w:color="FFFFFF" w:sz="0"/>
+            </w:tcBorders>
+            <w:tcMar>
+              <w:top w:type="dxa" w:w="30"/>
+              <w:left w:type="dxa" w:w="60"/>
+              <w:bottom w:type="dxa" w:w="30"/>
+              <w:right w:type="dxa" w:w="60"/>
+            </w:tcMar>
+            <w:vAlign w:val="center"/>
+          </w:tcPr>
+          <w:p>
+            <w:pPr>
+              <w:jc w:val="left"/>
+            </w:pPr>
+            <w:r>
+              <w:rPr>
+                <w:b w:val="false"/>
+                <w:bCs w:val="false"/>
+                <w:sz w:val="16"/>
+                <w:szCs w:val="16"/>
+              </w:rPr>
+              <w:t xml:space="preserve">Correct abstention</w:t>
+            </w:r>
+          </w:p>
+        </w:tc>
+        <w:tc>
+          <w:tcPr>
+            <w:tcW w:type="dxa" w:w="1300"/>
+            <w:tcBorders>
+              <w:top w:val="none" w:color="FFFFFF" w:sz="0"/>
+              <w:left w:val="none" w:color="FFFFFF" w:sz="0"/>
+              <w:bottom w:val="none" w:color="FFFFFF" w:sz="0"/>
+              <w:right w:val="none" w:color="FFFFFF" w:sz="0"/>
+            </w:tcBorders>
+            <w:tcMar>
+              <w:top w:type="dxa" w:w="30"/>
+              <w:left w:type="dxa" w:w="60"/>
+              <w:bottom w:type="dxa" w:w="30"/>
+              <w:right w:type="dxa" w:w="60"/>
+            </w:tcMar>
+            <w:vAlign w:val="center"/>
+          </w:tcPr>
+          <w:p>
+            <w:pPr>
+              <w:jc w:val="center"/>
+            </w:pPr>
+            <w:r>
+              <w:rPr>
+                <w:b w:val="false"/>
+                <w:bCs w:val="false"/>
+                <w:sz w:val="16"/>
+                <w:szCs w:val="16"/>
+              </w:rPr>
+              <w:t xml:space="preserve">4</w:t>
+            </w:r>
+          </w:p>
+        </w:tc>
+        <w:tc>
+          <w:tcPr>
+            <w:tcW w:type="dxa" w:w="1300"/>
+            <w:tcBorders>
+              <w:top w:val="none" w:color="FFFFFF" w:sz="0"/>
+              <w:left w:val="none" w:color="FFFFFF" w:sz="0"/>
+              <w:bottom w:val="none" w:color="FFFFFF" w:sz="0"/>
+              <w:right w:val="none" w:color="FFFFFF" w:sz="0"/>
+            </w:tcBorders>
+            <w:tcMar>
+              <w:top w:type="dxa" w:w="30"/>
+              <w:left w:type="dxa" w:w="60"/>
+              <w:bottom w:type="dxa" w:w="30"/>
+              <w:right w:type="dxa" w:w="60"/>
+            </w:tcMar>
+            <w:vAlign w:val="center"/>
+          </w:tcPr>
+          <w:p>
+            <w:pPr>
+              <w:jc w:val="center"/>
+            </w:pPr>
+            <w:r>
+              <w:rPr>
+                <w:b w:val="false"/>
+                <w:bCs w:val="false"/>
+                <w:sz w:val="16"/>
+                <w:szCs w:val="16"/>
+              </w:rPr>
+              <w:t xml:space="preserve">5</w:t>
+            </w:r>
+          </w:p>
+        </w:tc>
+      </w:tr>
+      <w:tr>
+        <w:tc>
+          <w:tcPr>
+            <w:tcW w:type="dxa" w:w="2300"/>
+            <w:tcBorders>
+              <w:top w:val="none" w:color="FFFFFF" w:sz="0"/>
+              <w:left w:val="none" w:color="FFFFFF" w:sz="0"/>
+              <w:bottom w:val="none" w:color="FFFFFF" w:sz="0"/>
+              <w:right w:val="none" w:color="FFFFFF" w:sz="0"/>
+            </w:tcBorders>
+            <w:tcMar>
+              <w:top w:type="dxa" w:w="30"/>
+              <w:left w:type="dxa" w:w="60"/>
+              <w:bottom w:type="dxa" w:w="30"/>
+              <w:right w:type="dxa" w:w="60"/>
+            </w:tcMar>
+            <w:vAlign w:val="center"/>
+          </w:tcPr>
+          <w:p>
+            <w:pPr>
+              <w:jc w:val="left"/>
+            </w:pPr>
+            <w:r>
+              <w:rPr>
+                <w:b w:val="false"/>
+                <w:bCs w:val="false"/>
+                <w:sz w:val="16"/>
+                <w:szCs w:val="16"/>
+              </w:rPr>
+              <w:t xml:space="preserve">False abstention</w:t>
+            </w:r>
+          </w:p>
+        </w:tc>
+        <w:tc>
+          <w:tcPr>
+            <w:tcW w:type="dxa" w:w="1300"/>
+            <w:tcBorders>
+              <w:top w:val="none" w:color="FFFFFF" w:sz="0"/>
+              <w:left w:val="none" w:color="FFFFFF" w:sz="0"/>
+              <w:bottom w:val="none" w:color="FFFFFF" w:sz="0"/>
+              <w:right w:val="none" w:color="FFFFFF" w:sz="0"/>
+            </w:tcBorders>
+            <w:tcMar>
+              <w:top w:type="dxa" w:w="30"/>
+              <w:left w:type="dxa" w:w="60"/>
+              <w:bottom w:type="dxa" w:w="30"/>
+              <w:right w:type="dxa" w:w="60"/>
+            </w:tcMar>
+            <w:vAlign w:val="center"/>
+          </w:tcPr>
+          <w:p>
+            <w:pPr>
+              <w:jc w:val="center"/>
+            </w:pPr>
+            <w:r>
+              <w:rPr>
+                <w:b w:val="false"/>
+                <w:bCs w:val="false"/>
+                <w:sz w:val="16"/>
+                <w:szCs w:val="16"/>
+              </w:rPr>
+              <w:t xml:space="preserve">4</w:t>
+            </w:r>
+          </w:p>
+        </w:tc>
+        <w:tc>
+          <w:tcPr>
+            <w:tcW w:type="dxa" w:w="1300"/>
+            <w:tcBorders>
+              <w:top w:val="none" w:color="FFFFFF" w:sz="0"/>
+              <w:left w:val="none" w:color="FFFFFF" w:sz="0"/>
+              <w:bottom w:val="none" w:color="FFFFFF" w:sz="0"/>
+              <w:right w:val="none" w:color="FFFFFF" w:sz="0"/>
+            </w:tcBorders>
+            <w:tcMar>
+              <w:top w:type="dxa" w:w="30"/>
+              <w:left w:type="dxa" w:w="60"/>
+              <w:bottom w:type="dxa" w:w="30"/>
+              <w:right w:type="dxa" w:w="60"/>
+            </w:tcMar>
+            <w:vAlign w:val="center"/>
+          </w:tcPr>
+          <w:p>
+            <w:pPr>
+              <w:jc w:val="center"/>
+            </w:pPr>
+            <w:r>
+              <w:rPr>
+                <w:b w:val="false"/>
+                <w:bCs w:val="false"/>
+                <w:sz w:val="16"/>
+                <w:szCs w:val="16"/>
+              </w:rPr>
+              <w:t xml:space="preserve">3</w:t>
+            </w:r>
+          </w:p>
+        </w:tc>
+      </w:tr>
+      <w:tr>
+        <w:tc>
+          <w:tcPr>
+            <w:tcW w:type="dxa" w:w="2300"/>
+            <w:tcBorders>
+              <w:top w:val="none" w:color="FFFFFF" w:sz="0"/>
+              <w:left w:val="none" w:color="FFFFFF" w:sz="0"/>
+              <w:bottom w:val="none" w:color="FFFFFF" w:sz="0"/>
+              <w:right w:val="none" w:color="FFFFFF" w:sz="0"/>
+            </w:tcBorders>
+            <w:tcMar>
+              <w:top w:type="dxa" w:w="30"/>
+              <w:left w:type="dxa" w:w="60"/>
+              <w:bottom w:type="dxa" w:w="30"/>
+              <w:right w:type="dxa" w:w="60"/>
+            </w:tcMar>
+            <w:vAlign w:val="center"/>
+          </w:tcPr>
+          <w:p>
+            <w:pPr>
+              <w:jc w:val="left"/>
+            </w:pPr>
+            <w:r>
+              <w:rPr>
+                <w:b w:val="false"/>
+                <w:bCs w:val="false"/>
+                <w:sz w:val="16"/>
+                <w:szCs w:val="16"/>
+              </w:rPr>
+              <w:t xml:space="preserve">General knowledge, labelled</w:t>
+            </w:r>
+          </w:p>
+        </w:tc>
+        <w:tc>
+          <w:tcPr>
+            <w:tcW w:type="dxa" w:w="1300"/>
+            <w:tcBorders>
+              <w:top w:val="none" w:color="FFFFFF" w:sz="0"/>
+              <w:left w:val="none" w:color="FFFFFF" w:sz="0"/>
+              <w:bottom w:val="none" w:color="FFFFFF" w:sz="0"/>
+              <w:right w:val="none" w:color="FFFFFF" w:sz="0"/>
+            </w:tcBorders>
+            <w:tcMar>
+              <w:top w:type="dxa" w:w="30"/>
+              <w:left w:type="dxa" w:w="60"/>
+              <w:bottom w:type="dxa" w:w="30"/>
+              <w:right w:type="dxa" w:w="60"/>
+            </w:tcMar>
+            <w:vAlign w:val="center"/>
+          </w:tcPr>
+          <w:p>
+            <w:pPr>
+              <w:jc w:val="center"/>
+            </w:pPr>
+            <w:r>
+              <w:rPr>
+                <w:b w:val="false"/>
+                <w:bCs w:val="false"/>
+                <w:sz w:val="16"/>
+                <w:szCs w:val="16"/>
+              </w:rPr>
+              <w:t xml:space="preserve">2</w:t>
+            </w:r>
+          </w:p>
+        </w:tc>
+        <w:tc>
+          <w:tcPr>
+            <w:tcW w:type="dxa" w:w="1300"/>
+            <w:tcBorders>
+              <w:top w:val="none" w:color="FFFFFF" w:sz="0"/>
+              <w:left w:val="none" w:color="FFFFFF" w:sz="0"/>
+              <w:bottom w:val="none" w:color="FFFFFF" w:sz="0"/>
+              <w:right w:val="none" w:color="FFFFFF" w:sz="0"/>
+            </w:tcBorders>
+            <w:tcMar>
+              <w:top w:type="dxa" w:w="30"/>
+              <w:left w:type="dxa" w:w="60"/>
+              <w:bottom w:type="dxa" w:w="30"/>
+              <w:right w:type="dxa" w:w="60"/>
+            </w:tcMar>
+            <w:vAlign w:val="center"/>
+          </w:tcPr>
+          <w:p>
+            <w:pPr>
+              <w:jc w:val="center"/>
+            </w:pPr>
+            <w:r>
+              <w:rPr>
+                <w:b w:val="false"/>
+                <w:bCs w:val="false"/>
+                <w:sz w:val="16"/>
+                <w:szCs w:val="16"/>
+              </w:rPr>
+              <w:t xml:space="preserve">2</w:t>
+            </w:r>
+          </w:p>
+        </w:tc>
+      </w:tr>
+      <w:tr>
+        <w:tc>
+          <w:tcPr>
+            <w:tcW w:type="dxa" w:w="2300"/>
+            <w:tcBorders>
+              <w:top w:val="none" w:color="FFFFFF" w:sz="0"/>
+              <w:left w:val="none" w:color="FFFFFF" w:sz="0"/>
+              <w:bottom w:val="single" w:color="000000" w:sz="4"/>
+              <w:right w:val="none" w:color="FFFFFF" w:sz="0"/>
+            </w:tcBorders>
+            <w:tcMar>
+              <w:top w:type="dxa" w:w="30"/>
+              <w:left w:type="dxa" w:w="60"/>
+              <w:bottom w:type="dxa" w:w="30"/>
+              <w:right w:type="dxa" w:w="60"/>
+            </w:tcMar>
+            <w:vAlign w:val="center"/>
+          </w:tcPr>
+          <w:p>
+            <w:pPr>
+              <w:jc w:val="left"/>
+            </w:pPr>
+            <w:r>
+              <w:rPr>
+                <w:b w:val="false"/>
+                <w:bCs w:val="false"/>
+                <w:sz w:val="16"/>
+                <w:szCs w:val="16"/>
+              </w:rPr>
+              <w:t xml:space="preserve">Other</w:t>
+            </w:r>
+          </w:p>
+        </w:tc>
+        <w:tc>
+          <w:tcPr>
+            <w:tcW w:type="dxa" w:w="1300"/>
+            <w:tcBorders>
+              <w:top w:val="none" w:color="FFFFFF" w:sz="0"/>
+              <w:left w:val="none" w:color="FFFFFF" w:sz="0"/>
+              <w:bottom w:val="single" w:color="000000" w:sz="4"/>
+              <w:right w:val="none" w:color="FFFFFF" w:sz="0"/>
+            </w:tcBorders>
+            <w:tcMar>
+              <w:top w:type="dxa" w:w="30"/>
+              <w:left w:type="dxa" w:w="60"/>
+              <w:bottom w:type="dxa" w:w="30"/>
+              <w:right w:type="dxa" w:w="60"/>
+            </w:tcMar>
+            <w:vAlign w:val="center"/>
+          </w:tcPr>
+          <w:p>
+            <w:pPr>
+              <w:jc w:val="center"/>
+            </w:pPr>
+            <w:r>
+              <w:rPr>
+                <w:b w:val="false"/>
+                <w:bCs w:val="false"/>
+                <w:sz w:val="16"/>
+                <w:szCs w:val="16"/>
+              </w:rPr>
+              <w:t xml:space="preserve">2</w:t>
+            </w:r>
+          </w:p>
+        </w:tc>
+        <w:tc>
+          <w:tcPr>
+            <w:tcW w:type="dxa" w:w="1300"/>
+            <w:tcBorders>
+              <w:top w:val="none" w:color="FFFFFF" w:sz="0"/>
+              <w:left w:val="none" w:color="FFFFFF" w:sz="0"/>
+              <w:bottom w:val="single" w:color="000000" w:sz="4"/>
+              <w:right w:val="none" w:color="FFFFFF" w:sz="0"/>
+            </w:tcBorders>
+            <w:tcMar>
+              <w:top w:type="dxa" w:w="30"/>
+              <w:left w:type="dxa" w:w="60"/>
+              <w:bottom w:type="dxa" w:w="30"/>
+              <w:right w:type="dxa" w:w="60"/>
+            </w:tcMar>
+            <w:vAlign w:val="center"/>
+          </w:tcPr>
+          <w:p>
+            <w:pPr>
+              <w:jc w:val="center"/>
+            </w:pPr>
+            <w:r>
+              <w:rPr>
+                <w:b w:val="false"/>
+                <w:bCs w:val="false"/>
+                <w:sz w:val="16"/>
+                <w:szCs w:val="16"/>
+              </w:rPr>
+              <w:t xml:space="preserve">1</w:t>
+            </w:r>
+          </w:p>
+        </w:tc>
+      </w:tr>
+    </w:tbl>
+    <w:p>
+      <w:pPr>
+        <w:spacing w:after="120"/>
+      </w:pPr>
+    </w:p>
+    <w:p>
+      <w:pPr>
+        <w:spacing w:after="120" w:line="250"/>
+        <w:jc w:val="both"/>
+      </w:pPr>
+      <w:r>
+        <w:rPr>
+          <w:sz w:val="20"/>
+          <w:szCs w:val="20"/>
+        </w:rPr>
+        <w:t xml:space="preserve">No wrong or mis-cited answer was ever shown as verified, and every verified claim was supported by the passage its proof quoted. Two of the three unanswerable questions and both false-premise questions were refused; the third unanswerable question was misrouted, as described below. The general-concept questions were answered and labelled as general knowledge. The paraphrased question, which asked how much money a tenant is owed if thrown out by force, was answered correctly from the eviction clause at a VCS of 1.00. Uploading a document twice was refused with the duplicate warning, replacing it restored the same 23 chunks, and deleting a document removed its chunks and made a question about it abstain. The mean response time was 17.3 s per question (median 16.1 s), almost all of it in the model call.</w:t>
+      </w:r>
+    </w:p>
+    <w:p>
+      <w:pPr>
+        <w:spacing w:after="120" w:line="250"/>
+        <w:jc w:val="both"/>
+      </w:pPr>
+      <w:r>
+        <w:rPr>
+          <w:sz w:val="20"/>
+          <w:szCs w:val="20"/>
+        </w:rPr>
+        <w:t xml:space="preserve">The main failure was false abstention, which had four causes. Two were bugs: the model once wrote citations in full-width brackets (【…】), and a file name containing a comma split the citation identifier in two. In both cases a correct answer was withheld. We fixed both, together with a routing error that sent a question about the tenancy act to the general-knowledge path, and added a regression test for each. Passing the recorded answers through the fixed code gave a VCS of 1.00 for both, and re-asking live verified one of them. The third cause was the NLI model: it scored a correct claim about an appeal deadline at 0.51. In a live rerun it also judged a claim NEUTRAL because the cited clause does not repeat the party’s name, which appears only in the agreement’s heading. The fourth was retrieval for comparison questions: a single candidate pool served the whole question and was filled by two of the three agreements, so the third never reached the model.</w:t>
+      </w:r>
+    </w:p>
+    <w:p>
+      <w:pPr>
+        <w:spacing w:after="120" w:line="250"/>
+        <w:jc w:val="both"/>
+      </w:pPr>
+      <w:r>
+        <w:rPr>
+          <w:sz w:val="20"/>
+          <w:szCs w:val="20"/>
+        </w:rPr>
+        <w:t xml:space="preserve">The same limit produced the most instructive failure (Fig. 8). Asked for the governing law of three agreements, the system showed two correct, verified answers. The model’s line saying the third was not in the excerpts carried no citation, so the parser discarded it, and the user saw an answer that looked complete. Nothing false was shown, but verification checks what an answer says, not what it leaves out. Partial answers therefore need to be flagged.</w:t>
+      </w:r>
+    </w:p>
+    <w:p>
+      <w:pPr>
+        <w:keepNext/>
+        <w:spacing w:after="60" w:before="120"/>
+        <w:jc w:val="center"/>
+      </w:pPr>
+      <w:r>
+        <w:drawing>
+          <wp:inline distT="0" distB="0" distL="0" distR="0">
+            <wp:extent cx="2857500" cy="2847975"/>
+            <wp:effectExtent t="0" r="0" b="0" l="0"/>
+            <wp:docPr id="1" name="" descr="" title=""/>
+            <wp:cNvGraphicFramePr>
+              <a:graphicFrameLocks xmlns:a="http://schemas.openxmlformats.org/drawingml/2006/main" noChangeAspect="1"/>
+            </wp:cNvGraphicFramePr>
+            <a:graphic xmlns:a="http://schemas.openxmlformats.org/drawingml/2006/main">
+              <a:graphicData uri="http://schemas.openxmlformats.org/drawingml/2006/picture">
+                <pic:pic xmlns:pic="http://schemas.openxmlformats.org/drawingml/2006/picture">
+                  <pic:nvPicPr>
+                    <pic:cNvPr id="0" name="" descr=""/>
+                    <pic:cNvPicPr>
+                      <a:picLocks noChangeAspect="1" noChangeArrowheads="1"/>
+                    </pic:cNvPicPr>
+                  </pic:nvPicPr>
+                  <pic:blipFill>
+                    <a:blip r:embed="rId14" cstate="none"/>
+                    <a:srcRect/>
+                    <a:stretch>
+                      <a:fillRect/>
+                    </a:stretch>
+                  </pic:blipFill>
+                  <pic:spPr bwMode="auto">
+                    <a:xfrm>
+                      <a:off x="0" y="0"/>
+                      <a:ext cx="2857500" cy="2847975"/>
+                    </a:xfrm>
+                    <a:prstGeom prst="rect">
+                      <a:avLst/>
+                    </a:prstGeom>
+                  </pic:spPr>
+                </pic:pic>
+              </a:graphicData>
+            </a:graphic>
+          </wp:inline>
+        </w:drawing>
+      </w:r>
+    </w:p>
+    <w:p>
+      <w:pPr>
+        <w:spacing w:after="200" w:line="230"/>
+        <w:jc w:val="both"/>
+      </w:pPr>
+      <w:r>
+        <w:rPr>
+          <w:sz w:val="17"/>
+          <w:szCs w:val="17"/>
+        </w:rPr>
+        <w:t xml:space="preserve">Fig. 8. A verified but incomplete answer. Both claims are correct and supported by their quoted clauses, but the question asked about three agreements; the model’s note that the third was missing had no citation and was dropped.</w:t>
       </w:r>
     </w:p>
     <w:p>
@@ -5672,7 +6525,7 @@
           <w:sz w:val="20"/>
           <w:szCs w:val="20"/>
         </w:rPr>
-        <w:t xml:space="preserve">Figs. 6 and 7 were plotted with Matplotlib directly from the result files logged for each experiment, and every number in Tables I and II comes from those files. Figs. 1 and 2 were drawn for this paper, and Figs. 3–5 are screenshots of the web interface taken during real use.</w:t>
+        <w:t xml:space="preserve">Figs. 6 and 7 were plotted with Matplotlib directly from the result files logged for each experiment, and every number in Tables I–III comes from those files. Figs. 1 and 2 were drawn for this paper, and Figs. 3–5 and 8 are screenshots of the web interface taken during real use.</w:t>
       </w:r>
     </w:p>
     <w:p>
@@ -5822,7 +6675,7 @@
           <w:sz w:val="20"/>
           <w:szCs w:val="20"/>
         </w:rPr>
-        <w:t xml:space="preserve"> roberta-large-mnli was not trained on legal text, and its NEUTRAL verdicts caused the false refusals.</w:t>
+        <w:t xml:space="preserve"> roberta-large-mnli was not trained on legal text, and its NEUTRAL verdicts caused most false refusals, including when a claim names a party that the cited clause does not repeat.</w:t>
       </w:r>
     </w:p>
     <w:p>
@@ -5842,14 +6695,14 @@
           <w:sz w:val="20"/>
           <w:szCs w:val="20"/>
         </w:rPr>
-        <w:t xml:space="preserve">Mean aggregation:</w:t>
-      </w:r>
-      <w:r>
-        <w:rPr>
-          <w:sz w:val="20"/>
-          <w:szCs w:val="20"/>
-        </w:rPr>
-        <w:t xml:space="preserve"> averaging lets a weak claim through when it sits next to a strong one, as in Fig. 3.</w:t>
+        <w:t xml:space="preserve">Comparison questions:</w:t>
+      </w:r>
+      <w:r>
+        <w:rPr>
+          <w:sz w:val="20"/>
+          <w:szCs w:val="20"/>
+        </w:rPr>
+        <w:t xml:space="preserve"> one retrieval pool serves the whole question, so a document can be crowded out, and a missing part of the answer is not flagged (Fig. 8).</w:t>
       </w:r>
     </w:p>
     <w:p>
@@ -5869,6 +6722,60 @@
           <w:sz w:val="20"/>
           <w:szCs w:val="20"/>
         </w:rPr>
+        <w:t xml:space="preserve">Small end-to-end test:</w:t>
+      </w:r>
+      <w:r>
+        <w:rPr>
+          <w:sz w:val="20"/>
+          <w:szCs w:val="20"/>
+        </w:rPr>
+        <w:t xml:space="preserve"> 15 questions and five documents, judged by one reviewer against answers fixed in advance; the judging was not blind.</w:t>
+      </w:r>
+    </w:p>
+    <w:p>
+      <w:pPr>
+        <w:pStyle w:val="ListParagraph"/>
+        <w:numPr>
+          <w:ilvl w:val="0"/>
+          <w:numId w:val="3"/>
+        </w:numPr>
+        <w:spacing w:after="80" w:line="250"/>
+        <w:jc w:val="both"/>
+      </w:pPr>
+      <w:r>
+        <w:rPr>
+          <w:b/>
+          <w:bCs/>
+          <w:sz w:val="20"/>
+          <w:szCs w:val="20"/>
+        </w:rPr>
+        <w:t xml:space="preserve">Mean aggregation:</w:t>
+      </w:r>
+      <w:r>
+        <w:rPr>
+          <w:sz w:val="20"/>
+          <w:szCs w:val="20"/>
+        </w:rPr>
+        <w:t xml:space="preserve"> averaging lets a weak claim through when it sits next to a strong one, as in Fig. 3.</w:t>
+      </w:r>
+    </w:p>
+    <w:p>
+      <w:pPr>
+        <w:pStyle w:val="ListParagraph"/>
+        <w:numPr>
+          <w:ilvl w:val="0"/>
+          <w:numId w:val="3"/>
+        </w:numPr>
+        <w:spacing w:after="80" w:line="250"/>
+        <w:jc w:val="both"/>
+      </w:pPr>
+      <w:r>
+        <w:rPr>
+          <w:b/>
+          <w:bCs/>
+          <w:sz w:val="20"/>
+          <w:szCs w:val="20"/>
+        </w:rPr>
         <w:t xml:space="preserve">Latency and quotas:</w:t>
       </w:r>
       <w:r>
@@ -5892,6 +6799,42 @@
           <w:szCs w:val="26"/>
         </w:rPr>
         <w:t xml:space="preserve">VI. FUTURE ENHANCEMENTS</w:t>
+      </w:r>
+    </w:p>
+    <w:p>
+      <w:pPr>
+        <w:pStyle w:val="ListParagraph"/>
+        <w:numPr>
+          <w:ilvl w:val="0"/>
+          <w:numId w:val="3"/>
+        </w:numPr>
+        <w:spacing w:after="80" w:line="250"/>
+        <w:jc w:val="both"/>
+      </w:pPr>
+      <w:r>
+        <w:rPr>
+          <w:sz w:val="20"/>
+          <w:szCs w:val="20"/>
+        </w:rPr>
+        <w:t xml:space="preserve">Retrieve per document for comparison questions, and show a partial-answer warning when the model reports missing information.</w:t>
+      </w:r>
+    </w:p>
+    <w:p>
+      <w:pPr>
+        <w:pStyle w:val="ListParagraph"/>
+        <w:numPr>
+          <w:ilvl w:val="0"/>
+          <w:numId w:val="3"/>
+        </w:numPr>
+        <w:spacing w:after="80" w:line="250"/>
+        <w:jc w:val="both"/>
+      </w:pPr>
+      <w:r>
+        <w:rPr>
+          <w:sz w:val="20"/>
+          <w:szCs w:val="20"/>
+        </w:rPr>
+        <w:t xml:space="preserve">Add the document title to the NLI premise, as SAC already does for retrieval, so a claim naming a party can be checked against a clause that does not repeat it.</w:t>
       </w:r>
     </w:p>
     <w:p>

</xml_diff>